<commit_message>
docs(sdr): §3.6.4 OTP + order-status + quick-reply templates
Co-Authored-By: Claude Opus 4.8 (1M context) <noreply@anthropic.com>
</commit_message>
<xml_diff>
--- a/PRODUCTS/03-helix-sdr-bdr-bot.docx
+++ b/PRODUCTS/03-helix-sdr-bdr-bot.docx
@@ -11943,6 +11943,688 @@
     </w:p>
     <w:p>
       <w:pPr>
+        <w:pStyle w:val="Heading3"/>
+        <w:bidi w:val="1"/>
+        <w:jc w:val="right"/>
+      </w:pPr>
+      <w:r>
+        <w:rPr>
+          <w:rFonts w:ascii="Arial" w:hAnsi="Arial"/>
+          <w:b w:val="0"/>
+          <w:sz w:val="24"/>
+          <w:rtl w:val="1"/>
+          <w:rFonts w:cs="Arial"/>
+        </w:rPr>
+        <w:t xml:space="preserve">🔐 3.6.4 אימות (OTP) · עדכון סטטוס הזמנה · Quick-Reply 🆕 — </w:t>
+      </w:r>
+      <w:r>
+        <w:rPr>
+          <w:rFonts w:ascii="Arial" w:hAnsi="Arial"/>
+          <w:b/>
+          <w:sz w:val="24"/>
+          <w:rtl w:val="1"/>
+          <w:rFonts w:cs="Arial"/>
+        </w:rPr>
+        <w:t>נבנה בקוד ✅</w:t>
+      </w:r>
+    </w:p>
+    <w:p>
+      <w:pPr>
+        <w:bidi w:val="1"/>
+        <w:jc w:val="right"/>
+      </w:pPr>
+      <w:r>
+        <w:rPr>
+          <w:rFonts w:ascii="Arial" w:hAnsi="Arial"/>
+          <w:b w:val="0"/>
+          <w:sz w:val="22"/>
+          <w:rtl w:val="1"/>
+          <w:rFonts w:cs="Arial"/>
+        </w:rPr>
+        <w:t>קטגוריית-תבניות שלישית, מעבר ל-lifecycle וה-outreach:</w:t>
+      </w:r>
+    </w:p>
+    <w:p>
+      <w:pPr>
+        <w:bidi w:val="1"/>
+        <w:jc w:val="right"/>
+      </w:pPr>
+      <w:r>
+        <w:rPr>
+          <w:rFonts w:ascii="Arial" w:hAnsi="Arial"/>
+          <w:b/>
+          <w:sz w:val="22"/>
+          <w:rtl w:val="1"/>
+          <w:rFonts w:cs="Arial"/>
+        </w:rPr>
+        <w:t>א. אימות (OTP)</w:t>
+      </w:r>
+      <w:r>
+        <w:rPr>
+          <w:rFonts w:ascii="Arial" w:hAnsi="Arial"/>
+          <w:b w:val="0"/>
+          <w:sz w:val="22"/>
+          <w:rtl w:val="1"/>
+          <w:rFonts w:cs="Arial"/>
+        </w:rPr>
+        <w:t xml:space="preserve"> — </w:t>
+      </w:r>
+      <w:r>
+        <w:rPr>
+          <w:rFonts w:ascii="Consolas" w:hAnsi="Consolas"/>
+          <w:b w:val="0"/>
+          <w:color w:val="B02A37"/>
+          <w:sz w:val="22"/>
+          <w:rtl w:val="1"/>
+          <w:rFonts w:cs="Consolas"/>
+        </w:rPr>
+        <w:t>sdr_otp</w:t>
+      </w:r>
+      <w:r>
+        <w:rPr>
+          <w:rFonts w:ascii="Arial" w:hAnsi="Arial"/>
+          <w:b w:val="0"/>
+          <w:sz w:val="22"/>
+          <w:rtl w:val="1"/>
+          <w:rFonts w:cs="Arial"/>
+        </w:rPr>
+        <w:t xml:space="preserve"> בקטגוריית </w:t>
+      </w:r>
+      <w:r>
+        <w:rPr>
+          <w:rFonts w:ascii="Arial" w:hAnsi="Arial"/>
+          <w:b/>
+          <w:sz w:val="22"/>
+          <w:rtl w:val="1"/>
+          <w:rFonts w:cs="Arial"/>
+        </w:rPr>
+        <w:t>AUTHENTICATION</w:t>
+      </w:r>
+      <w:r>
+        <w:rPr>
+          <w:rFonts w:ascii="Arial" w:hAnsi="Arial"/>
+          <w:b w:val="0"/>
+          <w:sz w:val="22"/>
+          <w:rtl w:val="1"/>
+          <w:rFonts w:cs="Arial"/>
+        </w:rPr>
+        <w:t xml:space="preserve"> (Meta מוסיף שורת-אבטחה + כפתור "העתקת הקוד" + תפוגה). קוד 6-ספרתי חד-פעמי, מוגבל-ניסיונות, נשמר ב-</w:t>
+      </w:r>
+      <w:r>
+        <w:rPr>
+          <w:rFonts w:ascii="Consolas" w:hAnsi="Consolas"/>
+          <w:b w:val="0"/>
+          <w:color w:val="B02A37"/>
+          <w:sz w:val="22"/>
+          <w:rtl w:val="1"/>
+          <w:rFonts w:cs="Consolas"/>
+        </w:rPr>
+        <w:t>otp_codes</w:t>
+      </w:r>
+      <w:r>
+        <w:rPr>
+          <w:rFonts w:ascii="Arial" w:hAnsi="Arial"/>
+          <w:b w:val="0"/>
+          <w:sz w:val="22"/>
+          <w:rtl w:val="1"/>
+          <w:rFonts w:cs="Arial"/>
+        </w:rPr>
+        <w:t xml:space="preserve"> (5 דק' תוקף). </w:t>
+      </w:r>
+      <w:r>
+        <w:rPr>
+          <w:rFonts w:ascii="Arial" w:hAnsi="Arial"/>
+          <w:b/>
+          <w:sz w:val="22"/>
+          <w:rtl w:val="1"/>
+          <w:rFonts w:cs="Arial"/>
+        </w:rPr>
+        <w:t>קבצים:</w:t>
+      </w:r>
+      <w:r>
+        <w:rPr>
+          <w:rFonts w:ascii="Arial" w:hAnsi="Arial"/>
+          <w:b w:val="0"/>
+          <w:sz w:val="22"/>
+          <w:rtl w:val="1"/>
+          <w:rFonts w:cs="Arial"/>
+        </w:rPr>
+        <w:t xml:space="preserve"> </w:t>
+      </w:r>
+      <w:r>
+        <w:rPr>
+          <w:rFonts w:ascii="Consolas" w:hAnsi="Consolas"/>
+          <w:b w:val="0"/>
+          <w:color w:val="B02A37"/>
+          <w:sz w:val="22"/>
+          <w:rtl w:val="1"/>
+          <w:rFonts w:cs="Consolas"/>
+        </w:rPr>
+        <w:t>lib/lifecycle/otp.ts</w:t>
+      </w:r>
+      <w:r>
+        <w:rPr>
+          <w:rFonts w:ascii="Arial" w:hAnsi="Arial"/>
+          <w:b w:val="0"/>
+          <w:sz w:val="22"/>
+          <w:rtl w:val="1"/>
+          <w:rFonts w:cs="Arial"/>
+        </w:rPr>
+        <w:t xml:space="preserve"> (</w:t>
+      </w:r>
+      <w:r>
+        <w:rPr>
+          <w:rFonts w:ascii="Consolas" w:hAnsi="Consolas"/>
+          <w:b w:val="0"/>
+          <w:color w:val="B02A37"/>
+          <w:sz w:val="22"/>
+          <w:rtl w:val="1"/>
+          <w:rFonts w:cs="Consolas"/>
+        </w:rPr>
+        <w:t>sendOtp</w:t>
+      </w:r>
+      <w:r>
+        <w:rPr>
+          <w:rFonts w:ascii="Arial" w:hAnsi="Arial"/>
+          <w:b w:val="0"/>
+          <w:sz w:val="22"/>
+          <w:rtl w:val="1"/>
+          <w:rFonts w:cs="Arial"/>
+        </w:rPr>
+        <w:t>/</w:t>
+      </w:r>
+      <w:r>
+        <w:rPr>
+          <w:rFonts w:ascii="Consolas" w:hAnsi="Consolas"/>
+          <w:b w:val="0"/>
+          <w:color w:val="B02A37"/>
+          <w:sz w:val="22"/>
+          <w:rtl w:val="1"/>
+          <w:rFonts w:cs="Consolas"/>
+        </w:rPr>
+        <w:t>verifyOtp</w:t>
+      </w:r>
+      <w:r>
+        <w:rPr>
+          <w:rFonts w:ascii="Arial" w:hAnsi="Arial"/>
+          <w:b w:val="0"/>
+          <w:sz w:val="22"/>
+          <w:rtl w:val="1"/>
+          <w:rFonts w:cs="Arial"/>
+        </w:rPr>
+        <w:t xml:space="preserve">) · </w:t>
+      </w:r>
+      <w:r>
+        <w:rPr>
+          <w:rFonts w:ascii="Consolas" w:hAnsi="Consolas"/>
+          <w:b w:val="0"/>
+          <w:color w:val="B02A37"/>
+          <w:sz w:val="22"/>
+          <w:rtl w:val="1"/>
+          <w:rFonts w:cs="Consolas"/>
+        </w:rPr>
+        <w:t>POST /api/auth/otp</w:t>
+      </w:r>
+      <w:r>
+        <w:rPr>
+          <w:rFonts w:ascii="Arial" w:hAnsi="Arial"/>
+          <w:b w:val="0"/>
+          <w:sz w:val="22"/>
+          <w:rtl w:val="1"/>
+          <w:rFonts w:cs="Arial"/>
+        </w:rPr>
+        <w:t xml:space="preserve"> (</w:t>
+      </w:r>
+      <w:r>
+        <w:rPr>
+          <w:rFonts w:ascii="Consolas" w:hAnsi="Consolas"/>
+          <w:b w:val="0"/>
+          <w:color w:val="B02A37"/>
+          <w:sz w:val="22"/>
+          <w:rtl w:val="1"/>
+          <w:rFonts w:cs="Consolas"/>
+        </w:rPr>
+        <w:t>action: send|verify</w:t>
+      </w:r>
+      <w:r>
+        <w:rPr>
+          <w:rFonts w:ascii="Arial" w:hAnsi="Arial"/>
+          <w:b w:val="0"/>
+          <w:sz w:val="22"/>
+          <w:rtl w:val="1"/>
+          <w:rFonts w:cs="Arial"/>
+        </w:rPr>
+        <w:t>). נגיש גם מהבוט: "שלח קוד אימות ל-0501234567".</w:t>
+      </w:r>
+    </w:p>
+    <w:p>
+      <w:pPr>
+        <w:bidi w:val="1"/>
+        <w:jc w:val="right"/>
+      </w:pPr>
+      <w:r>
+        <w:rPr>
+          <w:rFonts w:ascii="Arial" w:hAnsi="Arial"/>
+          <w:b/>
+          <w:sz w:val="22"/>
+          <w:rtl w:val="1"/>
+          <w:rFonts w:cs="Arial"/>
+        </w:rPr>
+        <w:t>ב. עדכון סטטוס הזמנה</w:t>
+      </w:r>
+      <w:r>
+        <w:rPr>
+          <w:rFonts w:ascii="Arial" w:hAnsi="Arial"/>
+          <w:b w:val="0"/>
+          <w:sz w:val="22"/>
+          <w:rtl w:val="1"/>
+          <w:rFonts w:cs="Arial"/>
+        </w:rPr>
+        <w:t xml:space="preserve"> (UTILITY) — </w:t>
+      </w:r>
+      <w:r>
+        <w:rPr>
+          <w:rFonts w:ascii="Consolas" w:hAnsi="Consolas"/>
+          <w:b w:val="0"/>
+          <w:color w:val="B02A37"/>
+          <w:sz w:val="22"/>
+          <w:rtl w:val="1"/>
+          <w:rFonts w:cs="Consolas"/>
+        </w:rPr>
+        <w:t>sdr_order_confirmed</w:t>
+      </w:r>
+      <w:r>
+        <w:rPr>
+          <w:rFonts w:ascii="Arial" w:hAnsi="Arial"/>
+          <w:b w:val="0"/>
+          <w:sz w:val="22"/>
+          <w:rtl w:val="1"/>
+          <w:rFonts w:cs="Arial"/>
+        </w:rPr>
+        <w:t xml:space="preserve"> (התקבלה + סכום) · </w:t>
+      </w:r>
+      <w:r>
+        <w:rPr>
+          <w:rFonts w:ascii="Consolas" w:hAnsi="Consolas"/>
+          <w:b w:val="0"/>
+          <w:color w:val="B02A37"/>
+          <w:sz w:val="22"/>
+          <w:rtl w:val="1"/>
+          <w:rFonts w:cs="Consolas"/>
+        </w:rPr>
+        <w:t>sdr_order_shipped</w:t>
+      </w:r>
+      <w:r>
+        <w:rPr>
+          <w:rFonts w:ascii="Arial" w:hAnsi="Arial"/>
+          <w:b w:val="0"/>
+          <w:sz w:val="22"/>
+          <w:rtl w:val="1"/>
+          <w:rFonts w:cs="Arial"/>
+        </w:rPr>
+        <w:t xml:space="preserve"> (יצאה + ETA + מספר מעקב) · </w:t>
+      </w:r>
+      <w:r>
+        <w:rPr>
+          <w:rFonts w:ascii="Consolas" w:hAnsi="Consolas"/>
+          <w:b w:val="0"/>
+          <w:color w:val="B02A37"/>
+          <w:sz w:val="22"/>
+          <w:rtl w:val="1"/>
+          <w:rFonts w:cs="Consolas"/>
+        </w:rPr>
+        <w:t>sdr_order_ready</w:t>
+      </w:r>
+      <w:r>
+        <w:rPr>
+          <w:rFonts w:ascii="Arial" w:hAnsi="Arial"/>
+          <w:b w:val="0"/>
+          <w:sz w:val="22"/>
+          <w:rtl w:val="1"/>
+          <w:rFonts w:cs="Arial"/>
+        </w:rPr>
+        <w:t xml:space="preserve"> (מוכנה לאיסוף + סניף + שעות). Stateless — מערכת-העסק מזינה נתוני-הזמנה בכל קריאה. </w:t>
+      </w:r>
+      <w:r>
+        <w:rPr>
+          <w:rFonts w:ascii="Arial" w:hAnsi="Arial"/>
+          <w:b/>
+          <w:sz w:val="22"/>
+          <w:rtl w:val="1"/>
+          <w:rFonts w:cs="Arial"/>
+        </w:rPr>
+        <w:t>קבצים:</w:t>
+      </w:r>
+      <w:r>
+        <w:rPr>
+          <w:rFonts w:ascii="Arial" w:hAnsi="Arial"/>
+          <w:b w:val="0"/>
+          <w:sz w:val="22"/>
+          <w:rtl w:val="1"/>
+          <w:rFonts w:cs="Arial"/>
+        </w:rPr>
+        <w:t xml:space="preserve"> </w:t>
+      </w:r>
+      <w:r>
+        <w:rPr>
+          <w:rFonts w:ascii="Consolas" w:hAnsi="Consolas"/>
+          <w:b w:val="0"/>
+          <w:color w:val="B02A37"/>
+          <w:sz w:val="22"/>
+          <w:rtl w:val="1"/>
+          <w:rFonts w:cs="Consolas"/>
+        </w:rPr>
+        <w:t>lib/lifecycle/orders.ts</w:t>
+      </w:r>
+      <w:r>
+        <w:rPr>
+          <w:rFonts w:ascii="Arial" w:hAnsi="Arial"/>
+          <w:b w:val="0"/>
+          <w:sz w:val="22"/>
+          <w:rtl w:val="1"/>
+          <w:rFonts w:cs="Arial"/>
+        </w:rPr>
+        <w:t xml:space="preserve"> (</w:t>
+      </w:r>
+      <w:r>
+        <w:rPr>
+          <w:rFonts w:ascii="Consolas" w:hAnsi="Consolas"/>
+          <w:b w:val="0"/>
+          <w:color w:val="B02A37"/>
+          <w:sz w:val="22"/>
+          <w:rtl w:val="1"/>
+          <w:rFonts w:cs="Consolas"/>
+        </w:rPr>
+        <w:t>sendOrderStatus</w:t>
+      </w:r>
+      <w:r>
+        <w:rPr>
+          <w:rFonts w:ascii="Arial" w:hAnsi="Arial"/>
+          <w:b w:val="0"/>
+          <w:sz w:val="22"/>
+          <w:rtl w:val="1"/>
+          <w:rFonts w:cs="Arial"/>
+        </w:rPr>
+        <w:t xml:space="preserve">) · </w:t>
+      </w:r>
+      <w:r>
+        <w:rPr>
+          <w:rFonts w:ascii="Consolas" w:hAnsi="Consolas"/>
+          <w:b w:val="0"/>
+          <w:color w:val="B02A37"/>
+          <w:sz w:val="22"/>
+          <w:rtl w:val="1"/>
+          <w:rFonts w:cs="Consolas"/>
+        </w:rPr>
+        <w:t>POST /api/lifecycle/order-status</w:t>
+      </w:r>
+      <w:r>
+        <w:rPr>
+          <w:rFonts w:ascii="Arial" w:hAnsi="Arial"/>
+          <w:b w:val="0"/>
+          <w:sz w:val="22"/>
+          <w:rtl w:val="1"/>
+          <w:rFonts w:cs="Arial"/>
+        </w:rPr>
+        <w:t xml:space="preserve"> (</w:t>
+      </w:r>
+      <w:r>
+        <w:rPr>
+          <w:rFonts w:ascii="Consolas" w:hAnsi="Consolas"/>
+          <w:b w:val="0"/>
+          <w:color w:val="B02A37"/>
+          <w:sz w:val="22"/>
+          <w:rtl w:val="1"/>
+          <w:rFonts w:cs="Consolas"/>
+        </w:rPr>
+        <w:t>status: confirmed|shipped|ready</w:t>
+      </w:r>
+      <w:r>
+        <w:rPr>
+          <w:rFonts w:ascii="Arial" w:hAnsi="Arial"/>
+          <w:b w:val="0"/>
+          <w:sz w:val="22"/>
+          <w:rtl w:val="1"/>
+          <w:rFonts w:cs="Arial"/>
+        </w:rPr>
+        <w:t>).</w:t>
+      </w:r>
+    </w:p>
+    <w:p>
+      <w:pPr>
+        <w:bidi w:val="1"/>
+        <w:jc w:val="right"/>
+      </w:pPr>
+      <w:r>
+        <w:rPr>
+          <w:rFonts w:ascii="Arial" w:hAnsi="Arial"/>
+          <w:b/>
+          <w:sz w:val="22"/>
+          <w:rtl w:val="1"/>
+          <w:rFonts w:cs="Arial"/>
+        </w:rPr>
+        <w:t>ג. Quick-Reply</w:t>
+      </w:r>
+      <w:r>
+        <w:rPr>
+          <w:rFonts w:ascii="Arial" w:hAnsi="Arial"/>
+          <w:b w:val="0"/>
+          <w:sz w:val="22"/>
+          <w:rtl w:val="1"/>
+          <w:rFonts w:cs="Arial"/>
+        </w:rPr>
+        <w:t xml:space="preserve"> (כפתורי-תשובה, בלי דף URL) — </w:t>
+      </w:r>
+      <w:r>
+        <w:rPr>
+          <w:rFonts w:ascii="Consolas" w:hAnsi="Consolas"/>
+          <w:b w:val="0"/>
+          <w:color w:val="B02A37"/>
+          <w:sz w:val="22"/>
+          <w:rtl w:val="1"/>
+          <w:rFonts w:cs="Consolas"/>
+        </w:rPr>
+        <w:t>sdr_appt_confirm_qr</w:t>
+      </w:r>
+      <w:r>
+        <w:rPr>
+          <w:rFonts w:ascii="Arial" w:hAnsi="Arial"/>
+          <w:b w:val="0"/>
+          <w:sz w:val="22"/>
+          <w:rtl w:val="1"/>
+          <w:rFonts w:cs="Arial"/>
+        </w:rPr>
+        <w:t xml:space="preserve"> (אישור/ביטול תור) · </w:t>
+      </w:r>
+      <w:r>
+        <w:rPr>
+          <w:rFonts w:ascii="Consolas" w:hAnsi="Consolas"/>
+          <w:b w:val="0"/>
+          <w:color w:val="B02A37"/>
+          <w:sz w:val="22"/>
+          <w:rtl w:val="1"/>
+          <w:rFonts w:cs="Consolas"/>
+        </w:rPr>
+        <w:t>sdr_reorder_qr</w:t>
+      </w:r>
+      <w:r>
+        <w:rPr>
+          <w:rFonts w:ascii="Arial" w:hAnsi="Arial"/>
+          <w:b w:val="0"/>
+          <w:sz w:val="22"/>
+          <w:rtl w:val="1"/>
+          <w:rFonts w:cs="Arial"/>
+        </w:rPr>
+        <w:t xml:space="preserve"> (הזמנה חוזרת כן/לא). ה-payload של הכפתור </w:t>
+      </w:r>
+      <w:r>
+        <w:rPr>
+          <w:rFonts w:ascii="Arial" w:hAnsi="Arial"/>
+          <w:b/>
+          <w:sz w:val="22"/>
+          <w:rtl w:val="1"/>
+          <w:rFonts w:cs="Arial"/>
+        </w:rPr>
+        <w:t>נקבע בזמן-שליחה</w:t>
+      </w:r>
+      <w:r>
+        <w:rPr>
+          <w:rFonts w:ascii="Arial" w:hAnsi="Arial"/>
+          <w:b w:val="0"/>
+          <w:sz w:val="22"/>
+          <w:rtl w:val="1"/>
+          <w:rFonts w:cs="Arial"/>
+        </w:rPr>
+        <w:t xml:space="preserve"> ומתאר את עצמו (</w:t>
+      </w:r>
+      <w:r>
+        <w:rPr>
+          <w:rFonts w:ascii="Consolas" w:hAnsi="Consolas"/>
+          <w:b w:val="0"/>
+          <w:color w:val="B02A37"/>
+          <w:sz w:val="22"/>
+          <w:rtl w:val="1"/>
+          <w:rFonts w:cs="Consolas"/>
+        </w:rPr>
+        <w:t>confirm:&lt;token&gt;</w:t>
+      </w:r>
+      <w:r>
+        <w:rPr>
+          <w:rFonts w:ascii="Arial" w:hAnsi="Arial"/>
+          <w:b w:val="0"/>
+          <w:sz w:val="22"/>
+          <w:rtl w:val="1"/>
+          <w:rFonts w:cs="Arial"/>
+        </w:rPr>
+        <w:t xml:space="preserve"> / </w:t>
+      </w:r>
+      <w:r>
+        <w:rPr>
+          <w:rFonts w:ascii="Consolas" w:hAnsi="Consolas"/>
+          <w:b w:val="0"/>
+          <w:color w:val="B02A37"/>
+          <w:sz w:val="22"/>
+          <w:rtl w:val="1"/>
+          <w:rFonts w:cs="Consolas"/>
+        </w:rPr>
+        <w:t>reorder_yes:&lt;id&gt;:&lt;product&gt;</w:t>
+      </w:r>
+      <w:r>
+        <w:rPr>
+          <w:rFonts w:ascii="Arial" w:hAnsi="Arial"/>
+          <w:b w:val="0"/>
+          <w:sz w:val="22"/>
+          <w:rtl w:val="1"/>
+          <w:rFonts w:cs="Arial"/>
+        </w:rPr>
+        <w:t xml:space="preserve">), כך שהלחיצה נוחתת ב-webhook מוכנה לביצוע — </w:t>
+      </w:r>
+      <w:r>
+        <w:rPr>
+          <w:rFonts w:ascii="Arial" w:hAnsi="Arial"/>
+          <w:b/>
+          <w:sz w:val="22"/>
+          <w:rtl w:val="1"/>
+          <w:rFonts w:cs="Arial"/>
+        </w:rPr>
+        <w:t>חוויה של קליק-אחד בתוך וואטסאפ</w:t>
+      </w:r>
+      <w:r>
+        <w:rPr>
+          <w:rFonts w:ascii="Arial" w:hAnsi="Arial"/>
+          <w:b w:val="0"/>
+          <w:sz w:val="22"/>
+          <w:rtl w:val="1"/>
+          <w:rFonts w:cs="Arial"/>
+        </w:rPr>
+        <w:t xml:space="preserve">. ה-runner מעדיף אוטומטית את גרסת ה-Quick-Reply לתזכורות-תור ולרכישה-חוזרת; ה-webhook מטפל בלחיצות דרך </w:t>
+      </w:r>
+      <w:r>
+        <w:rPr>
+          <w:rFonts w:ascii="Consolas" w:hAnsi="Consolas"/>
+          <w:b w:val="0"/>
+          <w:color w:val="B02A37"/>
+          <w:sz w:val="22"/>
+          <w:rtl w:val="1"/>
+          <w:rFonts w:cs="Consolas"/>
+        </w:rPr>
+        <w:t>applyButtonAction()</w:t>
+      </w:r>
+      <w:r>
+        <w:rPr>
+          <w:rFonts w:ascii="Arial" w:hAnsi="Arial"/>
+          <w:b w:val="0"/>
+          <w:sz w:val="22"/>
+          <w:rtl w:val="1"/>
+          <w:rFonts w:cs="Arial"/>
+        </w:rPr>
+        <w:t xml:space="preserve"> (אישור/ביטול תור, הזמנה חוזרת). </w:t>
+      </w:r>
+      <w:r>
+        <w:rPr>
+          <w:rFonts w:ascii="Arial" w:hAnsi="Arial"/>
+          <w:b/>
+          <w:sz w:val="22"/>
+          <w:rtl w:val="1"/>
+          <w:rFonts w:cs="Arial"/>
+        </w:rPr>
+        <w:t>טבלה:</w:t>
+      </w:r>
+      <w:r>
+        <w:rPr>
+          <w:rFonts w:ascii="Arial" w:hAnsi="Arial"/>
+          <w:b w:val="0"/>
+          <w:sz w:val="22"/>
+          <w:rtl w:val="1"/>
+          <w:rFonts w:cs="Arial"/>
+        </w:rPr>
+        <w:t xml:space="preserve"> </w:t>
+      </w:r>
+      <w:r>
+        <w:rPr>
+          <w:rFonts w:ascii="Consolas" w:hAnsi="Consolas"/>
+          <w:b w:val="0"/>
+          <w:color w:val="B02A37"/>
+          <w:sz w:val="22"/>
+          <w:rtl w:val="1"/>
+          <w:rFonts w:cs="Consolas"/>
+        </w:rPr>
+        <w:t>otp_codes</w:t>
+      </w:r>
+      <w:r>
+        <w:rPr>
+          <w:rFonts w:ascii="Arial" w:hAnsi="Arial"/>
+          <w:b w:val="0"/>
+          <w:sz w:val="22"/>
+          <w:rtl w:val="1"/>
+          <w:rFonts w:cs="Arial"/>
+        </w:rPr>
+        <w:t xml:space="preserve"> נוספה ל-</w:t>
+      </w:r>
+      <w:r>
+        <w:rPr>
+          <w:rFonts w:ascii="Consolas" w:hAnsi="Consolas"/>
+          <w:b w:val="0"/>
+          <w:color w:val="B02A37"/>
+          <w:sz w:val="22"/>
+          <w:rtl w:val="1"/>
+          <w:rFonts w:cs="Consolas"/>
+        </w:rPr>
+        <w:t>lifecycle.sql</w:t>
+      </w:r>
+      <w:r>
+        <w:rPr>
+          <w:rFonts w:ascii="Arial" w:hAnsi="Arial"/>
+          <w:b w:val="0"/>
+          <w:sz w:val="22"/>
+          <w:rtl w:val="1"/>
+          <w:rFonts w:cs="Arial"/>
+        </w:rPr>
+        <w:t>.</w:t>
+      </w:r>
+    </w:p>
+    <w:p>
+      <w:pPr>
         <w:bidi w:val="1"/>
         <w:ind w:left="360"/>
         <w:jc w:val="right"/>
@@ -11967,7 +12649,7 @@
           <w:rtl w:val="1"/>
           <w:rFonts w:cs="Arial"/>
         </w:rPr>
-        <w:t xml:space="preserve"> נפתר ב-§3.6.1 — הודעות יזומות עוברות ב-templates מאושרים; free-text רק כ-fallback בתוך חלון-24ש. נותר לך: ליצור/לאשר את התבניות ב-WhatsApp Manager (או להריץ </w:t>
+        <w:t xml:space="preserve"> נפתר ב-§3.6.1/3.6.4 — הודעות יזומות עוברות ב-templates מאושרים; free-text רק כ-fallback בתוך חלון-24ש. נותר לך: ליצור/לאשר את התבניות ב-WhatsApp Manager (או להריץ </w:t>
       </w:r>
       <w:r>
         <w:rPr>
@@ -12013,7 +12695,30 @@
           <w:rtl w:val="1"/>
           <w:rFonts w:cs="Arial"/>
         </w:rPr>
-        <w:t>.</w:t>
+        <w:t xml:space="preserve"> (כולל </w:t>
+      </w:r>
+      <w:r>
+        <w:rPr>
+          <w:rFonts w:ascii="Consolas" w:hAnsi="Consolas"/>
+          <w:b w:val="0"/>
+          <w:i/>
+          <w:color w:val="B02A37"/>
+          <w:sz w:val="22"/>
+          <w:rtl w:val="1"/>
+          <w:rFonts w:cs="Consolas"/>
+        </w:rPr>
+        <w:t>otp_codes</w:t>
+      </w:r>
+      <w:r>
+        <w:rPr>
+          <w:rFonts w:ascii="Arial" w:hAnsi="Arial"/>
+          <w:b w:val="0"/>
+          <w:i/>
+          <w:sz w:val="22"/>
+          <w:rtl w:val="1"/>
+          <w:rFonts w:cs="Arial"/>
+        </w:rPr>
+        <w:t>).</w:t>
       </w:r>
     </w:p>
     <w:p>

</xml_diff>

<commit_message>
docs(sdr): §3.6.5 inbound replies — canned/quick replies, Messenger wiring, bot access
Co-Authored-By: Claude Opus 4.8 (1M context) <noreply@anthropic.com>
</commit_message>
<xml_diff>
--- a/PRODUCTS/03-helix-sdr-bdr-bot.docx
+++ b/PRODUCTS/03-helix-sdr-bdr-bot.docx
@@ -12625,6 +12625,536 @@
     </w:p>
     <w:p>
       <w:pPr>
+        <w:pStyle w:val="Heading3"/>
+        <w:bidi w:val="1"/>
+        <w:jc w:val="right"/>
+      </w:pPr>
+      <w:r>
+        <w:rPr>
+          <w:rFonts w:ascii="Arial" w:hAnsi="Arial"/>
+          <w:b w:val="0"/>
+          <w:sz w:val="24"/>
+          <w:rtl w:val="1"/>
+          <w:rFonts w:cs="Arial"/>
+        </w:rPr>
+        <w:t xml:space="preserve">💬 3.6.5 תגובות ופניות נכנסות (Inbound / Reactive) 🆕 — </w:t>
+      </w:r>
+      <w:r>
+        <w:rPr>
+          <w:rFonts w:ascii="Arial" w:hAnsi="Arial"/>
+          <w:b/>
+          <w:sz w:val="24"/>
+          <w:rtl w:val="1"/>
+          <w:rFonts w:cs="Arial"/>
+        </w:rPr>
+        <w:t>נבנה בקוד ✅</w:t>
+      </w:r>
+    </w:p>
+    <w:p>
+      <w:pPr>
+        <w:bidi w:val="1"/>
+        <w:jc w:val="right"/>
+      </w:pPr>
+      <w:r>
+        <w:rPr>
+          <w:rFonts w:ascii="Arial" w:hAnsi="Arial"/>
+          <w:b/>
+          <w:sz w:val="22"/>
+          <w:rtl w:val="1"/>
+          <w:rFonts w:cs="Arial"/>
+        </w:rPr>
+        <w:t>הבחנה מהותית:</w:t>
+      </w:r>
+      <w:r>
+        <w:rPr>
+          <w:rFonts w:ascii="Arial" w:hAnsi="Arial"/>
+          <w:b w:val="0"/>
+          <w:sz w:val="22"/>
+          <w:rtl w:val="1"/>
+          <w:rFonts w:cs="Arial"/>
+        </w:rPr>
+        <w:t xml:space="preserve"> תבניות מאושרות הן ל</w:t>
+      </w:r>
+      <w:r>
+        <w:rPr>
+          <w:rFonts w:ascii="Arial" w:hAnsi="Arial"/>
+          <w:b/>
+          <w:sz w:val="22"/>
+          <w:rtl w:val="1"/>
+          <w:rFonts w:cs="Arial"/>
+        </w:rPr>
+        <w:t>יזום מחוץ-לחלון</w:t>
+      </w:r>
+      <w:r>
+        <w:rPr>
+          <w:rFonts w:ascii="Arial" w:hAnsi="Arial"/>
+          <w:b w:val="0"/>
+          <w:sz w:val="22"/>
+          <w:rtl w:val="1"/>
+          <w:rFonts w:cs="Arial"/>
+        </w:rPr>
+        <w:t xml:space="preserve"> בלבד. תגובות לפוסטים / פניות במסנג'ר / פניות בוואטסאפ הן </w:t>
+      </w:r>
+      <w:r>
+        <w:rPr>
+          <w:rFonts w:ascii="Arial" w:hAnsi="Arial"/>
+          <w:b/>
+          <w:sz w:val="22"/>
+          <w:rtl w:val="1"/>
+          <w:rFonts w:cs="Arial"/>
+        </w:rPr>
+        <w:t>inbound בתוך-חלון</w:t>
+      </w:r>
+      <w:r>
+        <w:rPr>
+          <w:rFonts w:ascii="Arial" w:hAnsi="Arial"/>
+          <w:b w:val="0"/>
+          <w:sz w:val="22"/>
+          <w:rtl w:val="1"/>
+          <w:rFonts w:cs="Arial"/>
+        </w:rPr>
+        <w:t xml:space="preserve"> → נענות ב</w:t>
+      </w:r>
+      <w:r>
+        <w:rPr>
+          <w:rFonts w:ascii="Arial" w:hAnsi="Arial"/>
+          <w:b/>
+          <w:sz w:val="22"/>
+          <w:rtl w:val="1"/>
+          <w:rFonts w:cs="Arial"/>
+        </w:rPr>
+        <w:t>טקסט חופשי</w:t>
+      </w:r>
+      <w:r>
+        <w:rPr>
+          <w:rFonts w:ascii="Arial" w:hAnsi="Arial"/>
+          <w:b w:val="0"/>
+          <w:sz w:val="22"/>
+          <w:rtl w:val="1"/>
+          <w:rFonts w:cs="Arial"/>
+        </w:rPr>
+        <w:t xml:space="preserve"> (AI או canned), בלי תבנית Meta.</w:t>
+      </w:r>
+    </w:p>
+    <w:p>
+      <w:pPr>
+        <w:pStyle w:val="ListBullet"/>
+        <w:bidi w:val="1"/>
+        <w:jc w:val="right"/>
+      </w:pPr>
+      <w:r>
+        <w:rPr>
+          <w:rFonts w:ascii="Arial" w:hAnsi="Arial"/>
+          <w:b/>
+          <w:sz w:val="22"/>
+          <w:rtl w:val="1"/>
+          <w:rFonts w:cs="Arial"/>
+        </w:rPr>
+        <w:t>פניות נכנסות (WhatsApp/Telegram/Messenger):</w:t>
+      </w:r>
+      <w:r>
+        <w:rPr>
+          <w:rFonts w:ascii="Arial" w:hAnsi="Arial"/>
+          <w:b w:val="0"/>
+          <w:sz w:val="22"/>
+          <w:rtl w:val="1"/>
+          <w:rFonts w:cs="Arial"/>
+        </w:rPr>
+        <w:t xml:space="preserve"> מנוע </w:t>
+      </w:r>
+      <w:r>
+        <w:rPr>
+          <w:rFonts w:ascii="Consolas" w:hAnsi="Consolas"/>
+          <w:b w:val="0"/>
+          <w:color w:val="B02A37"/>
+          <w:sz w:val="22"/>
+          <w:rtl w:val="1"/>
+          <w:rFonts w:cs="Consolas"/>
+        </w:rPr>
+        <w:t>handleInboundMessage</w:t>
+      </w:r>
+      <w:r>
+        <w:rPr>
+          <w:rFonts w:ascii="Arial" w:hAnsi="Arial"/>
+          <w:b w:val="0"/>
+          <w:sz w:val="22"/>
+          <w:rtl w:val="1"/>
+          <w:rFonts w:cs="Arial"/>
+        </w:rPr>
+        <w:t xml:space="preserve"> (סיווג → מענה). </w:t>
+      </w:r>
+      <w:r>
+        <w:rPr>
+          <w:rFonts w:ascii="Arial" w:hAnsi="Arial"/>
+          <w:b/>
+          <w:sz w:val="22"/>
+          <w:rtl w:val="1"/>
+          <w:rFonts w:cs="Arial"/>
+        </w:rPr>
+        <w:t>Messenger חובר עכשיו</w:t>
+      </w:r>
+      <w:r>
+        <w:rPr>
+          <w:rFonts w:ascii="Arial" w:hAnsi="Arial"/>
+          <w:b w:val="0"/>
+          <w:sz w:val="22"/>
+          <w:rtl w:val="1"/>
+          <w:rFonts w:cs="Arial"/>
+        </w:rPr>
+        <w:t xml:space="preserve"> — </w:t>
+      </w:r>
+      <w:r>
+        <w:rPr>
+          <w:rFonts w:ascii="Consolas" w:hAnsi="Consolas"/>
+          <w:b w:val="0"/>
+          <w:color w:val="B02A37"/>
+          <w:sz w:val="22"/>
+          <w:rtl w:val="1"/>
+          <w:rFonts w:cs="Consolas"/>
+        </w:rPr>
+        <w:t>app/api/webhooks/messenger/route.ts</w:t>
+      </w:r>
+      <w:r>
+        <w:rPr>
+          <w:rFonts w:ascii="Arial" w:hAnsi="Arial"/>
+          <w:b w:val="0"/>
+          <w:sz w:val="22"/>
+          <w:rtl w:val="1"/>
+          <w:rFonts w:cs="Arial"/>
+        </w:rPr>
+        <w:t xml:space="preserve"> מזין את אותו מנוע (התשתית כבר תמכה ב-</w:t>
+      </w:r>
+      <w:r>
+        <w:rPr>
+          <w:rFonts w:ascii="Consolas" w:hAnsi="Consolas"/>
+          <w:b w:val="0"/>
+          <w:color w:val="B02A37"/>
+          <w:sz w:val="22"/>
+          <w:rtl w:val="1"/>
+          <w:rFonts w:cs="Consolas"/>
+        </w:rPr>
+        <w:t>'messenger'</w:t>
+      </w:r>
+      <w:r>
+        <w:rPr>
+          <w:rFonts w:ascii="Arial" w:hAnsi="Arial"/>
+          <w:b w:val="0"/>
+          <w:sz w:val="22"/>
+          <w:rtl w:val="1"/>
+          <w:rFonts w:cs="Arial"/>
+        </w:rPr>
+        <w:t xml:space="preserve">); נוסף </w:t>
+      </w:r>
+      <w:r>
+        <w:rPr>
+          <w:rFonts w:ascii="Consolas" w:hAnsi="Consolas"/>
+          <w:b w:val="0"/>
+          <w:color w:val="B02A37"/>
+          <w:sz w:val="22"/>
+          <w:rtl w:val="1"/>
+          <w:rFonts w:cs="Consolas"/>
+        </w:rPr>
+        <w:t>sendMessenger</w:t>
+      </w:r>
+      <w:r>
+        <w:rPr>
+          <w:rFonts w:ascii="Arial" w:hAnsi="Arial"/>
+          <w:b w:val="0"/>
+          <w:sz w:val="22"/>
+          <w:rtl w:val="1"/>
+          <w:rFonts w:cs="Arial"/>
+        </w:rPr>
+        <w:t xml:space="preserve"> + case ב-executor לסגירת הלולאה.</w:t>
+      </w:r>
+    </w:p>
+    <w:p>
+      <w:pPr>
+        <w:pStyle w:val="ListBullet"/>
+        <w:bidi w:val="1"/>
+        <w:jc w:val="right"/>
+      </w:pPr>
+      <w:r>
+        <w:rPr>
+          <w:rFonts w:ascii="Arial" w:hAnsi="Arial"/>
+          <w:b/>
+          <w:sz w:val="22"/>
+          <w:rtl w:val="1"/>
+          <w:rFonts w:cs="Arial"/>
+        </w:rPr>
+        <w:t>תשובות שמורות (Canned / Quick Replies) 🆕:</w:t>
+      </w:r>
+      <w:r>
+        <w:rPr>
+          <w:rFonts w:ascii="Arial" w:hAnsi="Arial"/>
+          <w:b w:val="0"/>
+          <w:sz w:val="22"/>
+          <w:rtl w:val="1"/>
+          <w:rFonts w:cs="Arial"/>
+        </w:rPr>
+        <w:t xml:space="preserve"> FAQ מיידי לפניות נפוצות (מחיר/שעות/כתובת/זמינות/משלוח/נציג). ה-inbound </w:t>
+      </w:r>
+      <w:r>
+        <w:rPr>
+          <w:rFonts w:ascii="Arial" w:hAnsi="Arial"/>
+          <w:b/>
+          <w:sz w:val="22"/>
+          <w:rtl w:val="1"/>
+          <w:rFonts w:cs="Arial"/>
+        </w:rPr>
+        <w:t>מנסה canned קודם</w:t>
+      </w:r>
+      <w:r>
+        <w:rPr>
+          <w:rFonts w:ascii="Arial" w:hAnsi="Arial"/>
+          <w:b w:val="0"/>
+          <w:sz w:val="22"/>
+          <w:rtl w:val="1"/>
+          <w:rFonts w:cs="Arial"/>
+        </w:rPr>
+        <w:t xml:space="preserve"> (דטרמיניסטי, אפס-עלות) ורק אז ניסוח-AI. </w:t>
+      </w:r>
+      <w:r>
+        <w:rPr>
+          <w:rFonts w:ascii="Arial" w:hAnsi="Arial"/>
+          <w:b/>
+          <w:sz w:val="22"/>
+          <w:rtl w:val="1"/>
+          <w:rFonts w:cs="Arial"/>
+        </w:rPr>
+        <w:t>קבצים:</w:t>
+      </w:r>
+      <w:r>
+        <w:rPr>
+          <w:rFonts w:ascii="Arial" w:hAnsi="Arial"/>
+          <w:b w:val="0"/>
+          <w:sz w:val="22"/>
+          <w:rtl w:val="1"/>
+          <w:rFonts w:cs="Arial"/>
+        </w:rPr>
+        <w:t xml:space="preserve"> טבלת </w:t>
+      </w:r>
+      <w:r>
+        <w:rPr>
+          <w:rFonts w:ascii="Consolas" w:hAnsi="Consolas"/>
+          <w:b w:val="0"/>
+          <w:color w:val="B02A37"/>
+          <w:sz w:val="22"/>
+          <w:rtl w:val="1"/>
+          <w:rFonts w:cs="Consolas"/>
+        </w:rPr>
+        <w:t>canned_replies</w:t>
+      </w:r>
+      <w:r>
+        <w:rPr>
+          <w:rFonts w:ascii="Arial" w:hAnsi="Arial"/>
+          <w:b w:val="0"/>
+          <w:sz w:val="22"/>
+          <w:rtl w:val="1"/>
+          <w:rFonts w:cs="Arial"/>
+        </w:rPr>
+        <w:t xml:space="preserve"> · </w:t>
+      </w:r>
+      <w:r>
+        <w:rPr>
+          <w:rFonts w:ascii="Consolas" w:hAnsi="Consolas"/>
+          <w:b w:val="0"/>
+          <w:color w:val="B02A37"/>
+          <w:sz w:val="22"/>
+          <w:rtl w:val="1"/>
+          <w:rFonts w:cs="Consolas"/>
+        </w:rPr>
+        <w:t>lib/canned/{catalog,store}.ts</w:t>
+      </w:r>
+      <w:r>
+        <w:rPr>
+          <w:rFonts w:ascii="Arial" w:hAnsi="Arial"/>
+          <w:b w:val="0"/>
+          <w:sz w:val="22"/>
+          <w:rtl w:val="1"/>
+          <w:rFonts w:cs="Arial"/>
+        </w:rPr>
+        <w:t xml:space="preserve"> (ברירות-מחדל בקוד + override ב-DB). </w:t>
+      </w:r>
+      <w:r>
+        <w:rPr>
+          <w:rFonts w:ascii="Arial" w:hAnsi="Arial"/>
+          <w:b/>
+          <w:sz w:val="22"/>
+          <w:rtl w:val="1"/>
+          <w:rFonts w:cs="Arial"/>
+        </w:rPr>
+        <w:t>לא דורש אישור Meta</w:t>
+      </w:r>
+      <w:r>
+        <w:rPr>
+          <w:rFonts w:ascii="Arial" w:hAnsi="Arial"/>
+          <w:b w:val="0"/>
+          <w:sz w:val="22"/>
+          <w:rtl w:val="1"/>
+          <w:rFonts w:cs="Arial"/>
+        </w:rPr>
+        <w:t xml:space="preserve"> (בתוך חלון).</w:t>
+      </w:r>
+    </w:p>
+    <w:p>
+      <w:pPr>
+        <w:pStyle w:val="ListBullet"/>
+        <w:bidi w:val="1"/>
+        <w:jc w:val="right"/>
+      </w:pPr>
+      <w:r>
+        <w:rPr>
+          <w:rFonts w:ascii="Arial" w:hAnsi="Arial"/>
+          <w:b/>
+          <w:sz w:val="22"/>
+          <w:rtl w:val="1"/>
+          <w:rFonts w:cs="Arial"/>
+        </w:rPr>
+        <w:t>תגובות לפוסטים FB/IG (comment→reply→DM):</w:t>
+      </w:r>
+      <w:r>
+        <w:rPr>
+          <w:rFonts w:ascii="Arial" w:hAnsi="Arial"/>
+          <w:b w:val="0"/>
+          <w:sz w:val="22"/>
+          <w:rtl w:val="1"/>
+          <w:rFonts w:cs="Arial"/>
+        </w:rPr>
+        <w:t xml:space="preserve"> קיים ב-</w:t>
+      </w:r>
+      <w:r>
+        <w:rPr>
+          <w:rFonts w:ascii="Arial" w:hAnsi="Arial"/>
+          <w:b/>
+          <w:sz w:val="22"/>
+          <w:rtl w:val="1"/>
+          <w:rFonts w:cs="Arial"/>
+        </w:rPr>
+        <w:t>HELIX OPS</w:t>
+      </w:r>
+      <w:r>
+        <w:rPr>
+          <w:rFonts w:ascii="Arial" w:hAnsi="Arial"/>
+          <w:b w:val="0"/>
+          <w:sz w:val="22"/>
+          <w:rtl w:val="1"/>
+          <w:rFonts w:cs="Arial"/>
+        </w:rPr>
+        <w:t xml:space="preserve"> (</w:t>
+      </w:r>
+      <w:r>
+        <w:rPr>
+          <w:rFonts w:ascii="Consolas" w:hAnsi="Consolas"/>
+          <w:b w:val="0"/>
+          <w:color w:val="B02A37"/>
+          <w:sz w:val="22"/>
+          <w:rtl w:val="1"/>
+          <w:rFonts w:cs="Consolas"/>
+        </w:rPr>
+        <w:t>webhooks/meta</w:t>
+      </w:r>
+      <w:r>
+        <w:rPr>
+          <w:rFonts w:ascii="Arial" w:hAnsi="Arial"/>
+          <w:b w:val="0"/>
+          <w:sz w:val="22"/>
+          <w:rtl w:val="1"/>
+          <w:rFonts w:cs="Arial"/>
+        </w:rPr>
+        <w:t xml:space="preserve">: </w:t>
+      </w:r>
+      <w:r>
+        <w:rPr>
+          <w:rFonts w:ascii="Consolas" w:hAnsi="Consolas"/>
+          <w:b w:val="0"/>
+          <w:color w:val="B02A37"/>
+          <w:sz w:val="22"/>
+          <w:rtl w:val="1"/>
+          <w:rFonts w:cs="Consolas"/>
+        </w:rPr>
+        <w:t>matchFunnel</w:t>
+      </w:r>
+      <w:r>
+        <w:rPr>
+          <w:rFonts w:ascii="Arial" w:hAnsi="Arial"/>
+          <w:b w:val="0"/>
+          <w:sz w:val="22"/>
+          <w:rtl w:val="1"/>
+          <w:rFonts w:cs="Arial"/>
+        </w:rPr>
+        <w:t xml:space="preserve"> → </w:t>
+      </w:r>
+      <w:r>
+        <w:rPr>
+          <w:rFonts w:ascii="Consolas" w:hAnsi="Consolas"/>
+          <w:b w:val="0"/>
+          <w:color w:val="B02A37"/>
+          <w:sz w:val="22"/>
+          <w:rtl w:val="1"/>
+          <w:rFonts w:cs="Consolas"/>
+        </w:rPr>
+        <w:t>replyToComment</w:t>
+      </w:r>
+      <w:r>
+        <w:rPr>
+          <w:rFonts w:ascii="Arial" w:hAnsi="Arial"/>
+          <w:b w:val="0"/>
+          <w:sz w:val="22"/>
+          <w:rtl w:val="1"/>
+          <w:rFonts w:cs="Arial"/>
+        </w:rPr>
+        <w:t xml:space="preserve"> ציבורי + </w:t>
+      </w:r>
+      <w:r>
+        <w:rPr>
+          <w:rFonts w:ascii="Consolas" w:hAnsi="Consolas"/>
+          <w:b w:val="0"/>
+          <w:color w:val="B02A37"/>
+          <w:sz w:val="22"/>
+          <w:rtl w:val="1"/>
+          <w:rFonts w:cs="Consolas"/>
+        </w:rPr>
+        <w:t>sendPrivateReply</w:t>
+      </w:r>
+      <w:r>
+        <w:rPr>
+          <w:rFonts w:ascii="Arial" w:hAnsi="Arial"/>
+          <w:b w:val="0"/>
+          <w:sz w:val="22"/>
+          <w:rtl w:val="1"/>
+          <w:rFonts w:cs="Arial"/>
+        </w:rPr>
+        <w:t xml:space="preserve"> פרטי, סגנון ManyChat) + קטלוג-funnels מוכן.</w:t>
+      </w:r>
+    </w:p>
+    <w:p>
+      <w:pPr>
+        <w:bidi w:val="1"/>
+        <w:jc w:val="right"/>
+      </w:pPr>
+      <w:r>
+        <w:rPr>
+          <w:rFonts w:ascii="Arial" w:hAnsi="Arial"/>
+          <w:b/>
+          <w:sz w:val="22"/>
+          <w:rtl w:val="1"/>
+          <w:rFonts w:cs="Arial"/>
+        </w:rPr>
+        <w:t>גישה מהבוט (לא רק מהמערכת) 🆕:</w:t>
+      </w:r>
+      <w:r>
+        <w:rPr>
+          <w:rFonts w:ascii="Arial" w:hAnsi="Arial"/>
+          <w:b w:val="0"/>
+          <w:sz w:val="22"/>
+          <w:rtl w:val="1"/>
+          <w:rFonts w:cs="Arial"/>
+        </w:rPr>
+        <w:t xml:space="preserve"> פקודות אופרטור נוספו — "תבניות" (רשימת התבניות המאושרות), "תשובות שמורות" (רשימה), "הוסף תשובה &lt;מפתח&gt;: &lt;תוכן&gt;", "שלח תשובה &lt;מפתח&gt; ל-05…". (ב-OPS: "פאנלים" / "התקן פאנלים" / "תבניות".)</w:t>
+      </w:r>
+    </w:p>
+    <w:p>
+      <w:pPr>
         <w:bidi w:val="1"/>
         <w:ind w:left="360"/>
         <w:jc w:val="right"/>
@@ -12708,6 +13238,29 @@
           <w:rFonts w:cs="Consolas"/>
         </w:rPr>
         <w:t>otp_codes</w:t>
+      </w:r>
+      <w:r>
+        <w:rPr>
+          <w:rFonts w:ascii="Arial" w:hAnsi="Arial"/>
+          <w:b w:val="0"/>
+          <w:i/>
+          <w:sz w:val="22"/>
+          <w:rtl w:val="1"/>
+          <w:rFonts w:cs="Arial"/>
+        </w:rPr>
+        <w:t xml:space="preserve">, </w:t>
+      </w:r>
+      <w:r>
+        <w:rPr>
+          <w:rFonts w:ascii="Consolas" w:hAnsi="Consolas"/>
+          <w:b w:val="0"/>
+          <w:i/>
+          <w:color w:val="B02A37"/>
+          <w:sz w:val="22"/>
+          <w:rtl w:val="1"/>
+          <w:rFonts w:cs="Consolas"/>
+        </w:rPr>
+        <w:t>canned_replies</w:t>
       </w:r>
       <w:r>
         <w:rPr>

</xml_diff>

<commit_message>
docs(sdr): §3.6.6 LinkedIn inbound + cold-email templates
Co-Authored-By: Claude Opus 4.8 (1M context) <noreply@anthropic.com>
</commit_message>
<xml_diff>
--- a/PRODUCTS/03-helix-sdr-bdr-bot.docx
+++ b/PRODUCTS/03-helix-sdr-bdr-bot.docx
@@ -13151,6 +13151,271 @@
           <w:rFonts w:cs="Arial"/>
         </w:rPr>
         <w:t xml:space="preserve"> פקודות אופרטור נוספו — "תבניות" (רשימת התבניות המאושרות), "תשובות שמורות" (רשימה), "הוסף תשובה &lt;מפתח&gt;: &lt;תוכן&gt;", "שלח תשובה &lt;מפתח&gt; ל-05…". (ב-OPS: "פאנלים" / "התקן פאנלים" / "תבניות".)</w:t>
+      </w:r>
+    </w:p>
+    <w:p>
+      <w:pPr>
+        <w:pStyle w:val="Heading3"/>
+        <w:bidi w:val="1"/>
+        <w:jc w:val="right"/>
+      </w:pPr>
+      <w:r>
+        <w:rPr>
+          <w:rFonts w:ascii="Arial" w:hAnsi="Arial"/>
+          <w:b w:val="0"/>
+          <w:sz w:val="24"/>
+          <w:rtl w:val="1"/>
+          <w:rFonts w:cs="Arial"/>
+        </w:rPr>
+        <w:t xml:space="preserve">🔗 3.6.6 פניות בלינקדאין + תבניות מייל קר 🆕 — </w:t>
+      </w:r>
+      <w:r>
+        <w:rPr>
+          <w:rFonts w:ascii="Arial" w:hAnsi="Arial"/>
+          <w:b/>
+          <w:sz w:val="24"/>
+          <w:rtl w:val="1"/>
+          <w:rFonts w:cs="Arial"/>
+        </w:rPr>
+        <w:t>נבנה בקוד ✅</w:t>
+      </w:r>
+    </w:p>
+    <w:p>
+      <w:pPr>
+        <w:bidi w:val="1"/>
+        <w:jc w:val="right"/>
+      </w:pPr>
+      <w:r>
+        <w:rPr>
+          <w:rFonts w:ascii="Arial" w:hAnsi="Arial"/>
+          <w:b/>
+          <w:sz w:val="22"/>
+          <w:rtl w:val="1"/>
+          <w:rFonts w:cs="Arial"/>
+        </w:rPr>
+        <w:t>לינקדאין (inbound):</w:t>
+      </w:r>
+      <w:r>
+        <w:rPr>
+          <w:rFonts w:ascii="Arial" w:hAnsi="Arial"/>
+          <w:b w:val="0"/>
+          <w:sz w:val="22"/>
+          <w:rtl w:val="1"/>
+          <w:rFonts w:cs="Arial"/>
+        </w:rPr>
+        <w:t xml:space="preserve"> אין API רשמי להודעות → גשר דרך </w:t>
+      </w:r>
+      <w:r>
+        <w:rPr>
+          <w:rFonts w:ascii="Arial" w:hAnsi="Arial"/>
+          <w:b/>
+          <w:sz w:val="22"/>
+          <w:rtl w:val="1"/>
+          <w:rFonts w:cs="Arial"/>
+        </w:rPr>
+        <w:t>תוסף/session (PLUG)</w:t>
+      </w:r>
+      <w:r>
+        <w:rPr>
+          <w:rFonts w:ascii="Arial" w:hAnsi="Arial"/>
+          <w:b w:val="0"/>
+          <w:sz w:val="22"/>
+          <w:rtl w:val="1"/>
+          <w:rFonts w:cs="Arial"/>
+        </w:rPr>
+        <w:t xml:space="preserve">. </w:t>
+      </w:r>
+      <w:r>
+        <w:rPr>
+          <w:rFonts w:ascii="Consolas" w:hAnsi="Consolas"/>
+          <w:b w:val="0"/>
+          <w:color w:val="B02A37"/>
+          <w:sz w:val="22"/>
+          <w:rtl w:val="1"/>
+          <w:rFonts w:cs="Consolas"/>
+        </w:rPr>
+        <w:t>POST /api/ingest/linkedin</w:t>
+      </w:r>
+      <w:r>
+        <w:rPr>
+          <w:rFonts w:ascii="Arial" w:hAnsi="Arial"/>
+          <w:b w:val="0"/>
+          <w:sz w:val="22"/>
+          <w:rtl w:val="1"/>
+          <w:rFonts w:cs="Arial"/>
+        </w:rPr>
+        <w:t xml:space="preserve"> (מוגן secret) קולט DM/InMail נכנס → אותו מנוע-AI (נוסף </w:t>
+      </w:r>
+      <w:r>
+        <w:rPr>
+          <w:rFonts w:ascii="Consolas" w:hAnsi="Consolas"/>
+          <w:b w:val="0"/>
+          <w:color w:val="B02A37"/>
+          <w:sz w:val="22"/>
+          <w:rtl w:val="1"/>
+          <w:rFonts w:cs="Consolas"/>
+        </w:rPr>
+        <w:t>'linkedin'</w:t>
+      </w:r>
+      <w:r>
+        <w:rPr>
+          <w:rFonts w:ascii="Arial" w:hAnsi="Arial"/>
+          <w:b w:val="0"/>
+          <w:sz w:val="22"/>
+          <w:rtl w:val="1"/>
+          <w:rFonts w:cs="Arial"/>
+        </w:rPr>
+        <w:t xml:space="preserve"> ל-inbound). מכיוון שאין API-שליחה, ה-executor </w:t>
+      </w:r>
+      <w:r>
+        <w:rPr>
+          <w:rFonts w:ascii="Arial" w:hAnsi="Arial"/>
+          <w:b/>
+          <w:sz w:val="22"/>
+          <w:rtl w:val="1"/>
+          <w:rFonts w:cs="Arial"/>
+        </w:rPr>
+        <w:t>משאיר</w:t>
+      </w:r>
+      <w:r>
+        <w:rPr>
+          <w:rFonts w:ascii="Arial" w:hAnsi="Arial"/>
+          <w:b w:val="0"/>
+          <w:sz w:val="22"/>
+          <w:rtl w:val="1"/>
+          <w:rFonts w:cs="Arial"/>
+        </w:rPr>
+        <w:t xml:space="preserve"> מענֵי-לינקדאין ב-queue, וה-תוסף מושך אותם מ-</w:t>
+      </w:r>
+      <w:r>
+        <w:rPr>
+          <w:rFonts w:ascii="Consolas" w:hAnsi="Consolas"/>
+          <w:b w:val="0"/>
+          <w:color w:val="B02A37"/>
+          <w:sz w:val="22"/>
+          <w:rtl w:val="1"/>
+          <w:rFonts w:cs="Consolas"/>
+        </w:rPr>
+        <w:t>GET /api/linkedin/outbox</w:t>
+      </w:r>
+      <w:r>
+        <w:rPr>
+          <w:rFonts w:ascii="Arial" w:hAnsi="Arial"/>
+          <w:b w:val="0"/>
+          <w:sz w:val="22"/>
+          <w:rtl w:val="1"/>
+          <w:rFonts w:cs="Arial"/>
+        </w:rPr>
+        <w:t xml:space="preserve"> ומסמן שנשלחו (POST). מיושר ל-§4.5 (LinkedIn = אפור, רק דרך session של המשתמש).</w:t>
+      </w:r>
+    </w:p>
+    <w:p>
+      <w:pPr>
+        <w:bidi w:val="1"/>
+        <w:jc w:val="right"/>
+      </w:pPr>
+      <w:r>
+        <w:rPr>
+          <w:rFonts w:ascii="Arial" w:hAnsi="Arial"/>
+          <w:b/>
+          <w:sz w:val="22"/>
+          <w:rtl w:val="1"/>
+          <w:rFonts w:cs="Arial"/>
+        </w:rPr>
+        <w:t>מייל קר (תבניות):</w:t>
+      </w:r>
+      <w:r>
+        <w:rPr>
+          <w:rFonts w:ascii="Arial" w:hAnsi="Arial"/>
+          <w:b w:val="0"/>
+          <w:sz w:val="22"/>
+          <w:rtl w:val="1"/>
+          <w:rFonts w:cs="Arial"/>
+        </w:rPr>
+        <w:t xml:space="preserve"> </w:t>
+      </w:r>
+      <w:r>
+        <w:rPr>
+          <w:rFonts w:ascii="Consolas" w:hAnsi="Consolas"/>
+          <w:b w:val="0"/>
+          <w:color w:val="B02A37"/>
+          <w:sz w:val="22"/>
+          <w:rtl w:val="1"/>
+          <w:rFonts w:cs="Consolas"/>
+        </w:rPr>
+        <w:t>lib/templates/email-catalog.ts</w:t>
+      </w:r>
+      <w:r>
+        <w:rPr>
+          <w:rFonts w:ascii="Arial" w:hAnsi="Arial"/>
+          <w:b w:val="0"/>
+          <w:sz w:val="22"/>
+          <w:rtl w:val="1"/>
+          <w:rFonts w:cs="Arial"/>
+        </w:rPr>
+        <w:t xml:space="preserve"> — </w:t>
+      </w:r>
+      <w:r>
+        <w:rPr>
+          <w:rFonts w:ascii="Arial" w:hAnsi="Arial"/>
+          <w:b/>
+          <w:sz w:val="22"/>
+          <w:rtl w:val="1"/>
+          <w:rFonts w:cs="Arial"/>
+        </w:rPr>
+        <w:t>רצף 4 מגעים</w:t>
+      </w:r>
+      <w:r>
+        <w:rPr>
+          <w:rFonts w:ascii="Arial" w:hAnsi="Arial"/>
+          <w:b w:val="0"/>
+          <w:sz w:val="22"/>
+          <w:rtl w:val="1"/>
+          <w:rFonts w:cs="Arial"/>
+        </w:rPr>
+        <w:t xml:space="preserve"> (פתיח → תזכורת → ערך/הוכחה → פרידה), נושא+גוף עם merge-fields (</w:t>
+      </w:r>
+      <w:r>
+        <w:rPr>
+          <w:rFonts w:ascii="Consolas" w:hAnsi="Consolas"/>
+          <w:b w:val="0"/>
+          <w:color w:val="B02A37"/>
+          <w:sz w:val="22"/>
+          <w:rtl w:val="1"/>
+          <w:rFonts w:cs="Consolas"/>
+        </w:rPr>
+        <w:t>{{name}} {{company}} {{trigger}} {{value}} {{proof}} {{cta}} {{sender}}</w:t>
+      </w:r>
+      <w:r>
+        <w:rPr>
+          <w:rFonts w:ascii="Arial" w:hAnsi="Arial"/>
+          <w:b w:val="0"/>
+          <w:sz w:val="22"/>
+          <w:rtl w:val="1"/>
+          <w:rFonts w:cs="Arial"/>
+        </w:rPr>
+        <w:t xml:space="preserve">), תואם ל-Cold Email playbook §3.5. </w:t>
+      </w:r>
+      <w:r>
+        <w:rPr>
+          <w:rFonts w:ascii="Consolas" w:hAnsi="Consolas"/>
+          <w:b w:val="0"/>
+          <w:color w:val="B02A37"/>
+          <w:sz w:val="22"/>
+          <w:rtl w:val="1"/>
+          <w:rFonts w:cs="Consolas"/>
+        </w:rPr>
+        <w:t>POST /api/outreach/cold-email</w:t>
+      </w:r>
+      <w:r>
+        <w:rPr>
+          <w:rFonts w:ascii="Arial" w:hAnsi="Arial"/>
+          <w:b w:val="0"/>
+          <w:sz w:val="22"/>
+          <w:rtl w:val="1"/>
+          <w:rFonts w:cs="Arial"/>
+        </w:rPr>
+        <w:t xml:space="preserve"> מרנדר ומכניס לאישור (HITL, §30A); ה-executor פורק נושא+גוף (sentinel) ושולח דרך קונפיג המייל. נגיש מהבוט: "תבניות מייל". (מייל לא דורש אישור Meta.)</w:t>
       </w:r>
     </w:p>
     <w:p>

</xml_diff>

<commit_message>
docs(sdr): §3.6.7 custom/BYO templates upload
Co-Authored-By: Claude Opus 4.8 (1M context) <noreply@anthropic.com>
</commit_message>
<xml_diff>
--- a/PRODUCTS/03-helix-sdr-bdr-bot.docx
+++ b/PRODUCTS/03-helix-sdr-bdr-bot.docx
@@ -13420,6 +13420,377 @@
     </w:p>
     <w:p>
       <w:pPr>
+        <w:pStyle w:val="Heading3"/>
+        <w:bidi w:val="1"/>
+        <w:jc w:val="right"/>
+      </w:pPr>
+      <w:r>
+        <w:rPr>
+          <w:rFonts w:ascii="Arial" w:hAnsi="Arial"/>
+          <w:b w:val="0"/>
+          <w:sz w:val="24"/>
+          <w:rtl w:val="1"/>
+          <w:rFonts w:cs="Arial"/>
+        </w:rPr>
+        <w:t xml:space="preserve">🎨 3.6.7 העלאת תבניות עצמאית (Custom / BYO-Templates) 🆕 — </w:t>
+      </w:r>
+      <w:r>
+        <w:rPr>
+          <w:rFonts w:ascii="Arial" w:hAnsi="Arial"/>
+          <w:b/>
+          <w:sz w:val="24"/>
+          <w:rtl w:val="1"/>
+          <w:rFonts w:cs="Arial"/>
+        </w:rPr>
+        <w:t>נבנה בקוד ✅</w:t>
+      </w:r>
+    </w:p>
+    <w:p>
+      <w:pPr>
+        <w:bidi w:val="1"/>
+        <w:jc w:val="right"/>
+      </w:pPr>
+      <w:r>
+        <w:rPr>
+          <w:rFonts w:ascii="Arial" w:hAnsi="Arial"/>
+          <w:b w:val="0"/>
+          <w:sz w:val="22"/>
+          <w:rtl w:val="1"/>
+          <w:rFonts w:cs="Arial"/>
+        </w:rPr>
+        <w:t xml:space="preserve">המשתמש מגדיר </w:t>
+      </w:r>
+      <w:r>
+        <w:rPr>
+          <w:rFonts w:ascii="Arial" w:hAnsi="Arial"/>
+          <w:b/>
+          <w:sz w:val="22"/>
+          <w:rtl w:val="1"/>
+          <w:rFonts w:cs="Arial"/>
+        </w:rPr>
+        <w:t>תבניות משלו לכל סוג הודעה</w:t>
+      </w:r>
+      <w:r>
+        <w:rPr>
+          <w:rFonts w:ascii="Arial" w:hAnsi="Arial"/>
+          <w:b w:val="0"/>
+          <w:sz w:val="22"/>
+          <w:rtl w:val="1"/>
+          <w:rFonts w:cs="Arial"/>
+        </w:rPr>
+        <w:t xml:space="preserve">, במקום/מעל התבניות שלנו. טבלת </w:t>
+      </w:r>
+      <w:r>
+        <w:rPr>
+          <w:rFonts w:ascii="Consolas" w:hAnsi="Consolas"/>
+          <w:b w:val="0"/>
+          <w:color w:val="B02A37"/>
+          <w:sz w:val="22"/>
+          <w:rtl w:val="1"/>
+          <w:rFonts w:cs="Consolas"/>
+        </w:rPr>
+        <w:t>custom_templates</w:t>
+      </w:r>
+      <w:r>
+        <w:rPr>
+          <w:rFonts w:ascii="Arial" w:hAnsi="Arial"/>
+          <w:b w:val="0"/>
+          <w:sz w:val="22"/>
+          <w:rtl w:val="1"/>
+          <w:rFonts w:cs="Arial"/>
+        </w:rPr>
+        <w:t xml:space="preserve"> (</w:t>
+      </w:r>
+      <w:r>
+        <w:rPr>
+          <w:rFonts w:ascii="Consolas" w:hAnsi="Consolas"/>
+          <w:b w:val="0"/>
+          <w:color w:val="B02A37"/>
+          <w:sz w:val="22"/>
+          <w:rtl w:val="1"/>
+          <w:rFonts w:cs="Consolas"/>
+        </w:rPr>
+        <w:t>kind</w:t>
+      </w:r>
+      <w:r>
+        <w:rPr>
+          <w:rFonts w:ascii="Arial" w:hAnsi="Arial"/>
+          <w:b w:val="0"/>
+          <w:sz w:val="22"/>
+          <w:rtl w:val="1"/>
+          <w:rFonts w:cs="Arial"/>
+        </w:rPr>
+        <w:t xml:space="preserve">: whatsapp|email · </w:t>
+      </w:r>
+      <w:r>
+        <w:rPr>
+          <w:rFonts w:ascii="Consolas" w:hAnsi="Consolas"/>
+          <w:b w:val="0"/>
+          <w:color w:val="B02A37"/>
+          <w:sz w:val="22"/>
+          <w:rtl w:val="1"/>
+          <w:rFonts w:cs="Consolas"/>
+        </w:rPr>
+        <w:t>definition</w:t>
+      </w:r>
+      <w:r>
+        <w:rPr>
+          <w:rFonts w:ascii="Arial" w:hAnsi="Arial"/>
+          <w:b w:val="0"/>
+          <w:sz w:val="22"/>
+          <w:rtl w:val="1"/>
+          <w:rFonts w:cs="Arial"/>
+        </w:rPr>
+        <w:t xml:space="preserve"> jsonb) — תבנית מותאמת עם אותו </w:t>
+      </w:r>
+      <w:r>
+        <w:rPr>
+          <w:rFonts w:ascii="Consolas" w:hAnsi="Consolas"/>
+          <w:b w:val="0"/>
+          <w:color w:val="B02A37"/>
+          <w:sz w:val="22"/>
+          <w:rtl w:val="1"/>
+          <w:rFonts w:cs="Consolas"/>
+        </w:rPr>
+        <w:t>key</w:t>
+      </w:r>
+      <w:r>
+        <w:rPr>
+          <w:rFonts w:ascii="Arial" w:hAnsi="Arial"/>
+          <w:b w:val="0"/>
+          <w:sz w:val="22"/>
+          <w:rtl w:val="1"/>
+          <w:rFonts w:cs="Arial"/>
+        </w:rPr>
+        <w:t xml:space="preserve"> </w:t>
+      </w:r>
+      <w:r>
+        <w:rPr>
+          <w:rFonts w:ascii="Arial" w:hAnsi="Arial"/>
+          <w:b/>
+          <w:sz w:val="22"/>
+          <w:rtl w:val="1"/>
+          <w:rFonts w:cs="Arial"/>
+        </w:rPr>
+        <w:t>דורסת</w:t>
+      </w:r>
+      <w:r>
+        <w:rPr>
+          <w:rFonts w:ascii="Arial" w:hAnsi="Arial"/>
+          <w:b w:val="0"/>
+          <w:sz w:val="22"/>
+          <w:rtl w:val="1"/>
+          <w:rFonts w:cs="Arial"/>
+        </w:rPr>
+        <w:t xml:space="preserve"> את המובנית. </w:t>
+      </w:r>
+      <w:r>
+        <w:rPr>
+          <w:rFonts w:ascii="Arial" w:hAnsi="Arial"/>
+          <w:b/>
+          <w:sz w:val="22"/>
+          <w:rtl w:val="1"/>
+          <w:rFonts w:cs="Arial"/>
+        </w:rPr>
+        <w:t>קבצים:</w:t>
+      </w:r>
+      <w:r>
+        <w:rPr>
+          <w:rFonts w:ascii="Arial" w:hAnsi="Arial"/>
+          <w:b w:val="0"/>
+          <w:sz w:val="22"/>
+          <w:rtl w:val="1"/>
+          <w:rFonts w:cs="Arial"/>
+        </w:rPr>
+        <w:t xml:space="preserve"> </w:t>
+      </w:r>
+      <w:r>
+        <w:rPr>
+          <w:rFonts w:ascii="Consolas" w:hAnsi="Consolas"/>
+          <w:b w:val="0"/>
+          <w:color w:val="B02A37"/>
+          <w:sz w:val="22"/>
+          <w:rtl w:val="1"/>
+          <w:rFonts w:cs="Consolas"/>
+        </w:rPr>
+        <w:t>lib/templates/custom.ts</w:t>
+      </w:r>
+      <w:r>
+        <w:rPr>
+          <w:rFonts w:ascii="Arial" w:hAnsi="Arial"/>
+          <w:b w:val="0"/>
+          <w:sz w:val="22"/>
+          <w:rtl w:val="1"/>
+          <w:rFonts w:cs="Arial"/>
+        </w:rPr>
+        <w:t xml:space="preserve"> (מיזוג מובנה∪מותאם, CRUD, ולידציית-shape) · </w:t>
+      </w:r>
+      <w:r>
+        <w:rPr>
+          <w:rFonts w:ascii="Consolas" w:hAnsi="Consolas"/>
+          <w:b w:val="0"/>
+          <w:color w:val="B02A37"/>
+          <w:sz w:val="22"/>
+          <w:rtl w:val="1"/>
+          <w:rFonts w:cs="Consolas"/>
+        </w:rPr>
+        <w:t>POST/GET/DELETE /api/templates/custom</w:t>
+      </w:r>
+      <w:r>
+        <w:rPr>
+          <w:rFonts w:ascii="Arial" w:hAnsi="Arial"/>
+          <w:b w:val="0"/>
+          <w:sz w:val="22"/>
+          <w:rtl w:val="1"/>
+          <w:rFonts w:cs="Arial"/>
+        </w:rPr>
+        <w:t xml:space="preserve"> (יחיד או </w:t>
+      </w:r>
+      <w:r>
+        <w:rPr>
+          <w:rFonts w:ascii="Arial" w:hAnsi="Arial"/>
+          <w:b/>
+          <w:sz w:val="22"/>
+          <w:rtl w:val="1"/>
+          <w:rFonts w:cs="Arial"/>
+        </w:rPr>
+        <w:t>bulk</w:t>
+      </w:r>
+      <w:r>
+        <w:rPr>
+          <w:rFonts w:ascii="Arial" w:hAnsi="Arial"/>
+          <w:b w:val="0"/>
+          <w:sz w:val="22"/>
+          <w:rtl w:val="1"/>
+          <w:rFonts w:cs="Arial"/>
+        </w:rPr>
+        <w:t xml:space="preserve">). המיזוג זורם לכל מקום: </w:t>
+      </w:r>
+      <w:r>
+        <w:rPr>
+          <w:rFonts w:ascii="Arial" w:hAnsi="Arial"/>
+          <w:b/>
+          <w:sz w:val="22"/>
+          <w:rtl w:val="1"/>
+          <w:rFonts w:cs="Arial"/>
+        </w:rPr>
+        <w:t>הרישום ב-WABA</w:t>
+      </w:r>
+      <w:r>
+        <w:rPr>
+          <w:rFonts w:ascii="Arial" w:hAnsi="Arial"/>
+          <w:b w:val="0"/>
+          <w:sz w:val="22"/>
+          <w:rtl w:val="1"/>
+          <w:rFonts w:cs="Arial"/>
+        </w:rPr>
+        <w:t xml:space="preserve"> (</w:t>
+      </w:r>
+      <w:r>
+        <w:rPr>
+          <w:rFonts w:ascii="Consolas" w:hAnsi="Consolas"/>
+          <w:b w:val="0"/>
+          <w:color w:val="B02A37"/>
+          <w:sz w:val="22"/>
+          <w:rtl w:val="1"/>
+          <w:rFonts w:cs="Consolas"/>
+        </w:rPr>
+        <w:t>/api/templates/sync</w:t>
+      </w:r>
+      <w:r>
+        <w:rPr>
+          <w:rFonts w:ascii="Arial" w:hAnsi="Arial"/>
+          <w:b w:val="0"/>
+          <w:sz w:val="22"/>
+          <w:rtl w:val="1"/>
+          <w:rFonts w:cs="Arial"/>
+        </w:rPr>
+        <w:t xml:space="preserve"> רושם מובנה∪מותאם), </w:t>
+      </w:r>
+      <w:r>
+        <w:rPr>
+          <w:rFonts w:ascii="Arial" w:hAnsi="Arial"/>
+          <w:b/>
+          <w:sz w:val="22"/>
+          <w:rtl w:val="1"/>
+          <w:rFonts w:cs="Arial"/>
+        </w:rPr>
+        <w:t>ה-runner</w:t>
+      </w:r>
+      <w:r>
+        <w:rPr>
+          <w:rFonts w:ascii="Arial" w:hAnsi="Arial"/>
+          <w:b w:val="0"/>
+          <w:sz w:val="22"/>
+          <w:rtl w:val="1"/>
+          <w:rFonts w:cs="Arial"/>
+        </w:rPr>
+        <w:t xml:space="preserve"> (דורס שם-תבנית לתזכורות), </w:t>
+      </w:r>
+      <w:r>
+        <w:rPr>
+          <w:rFonts w:ascii="Arial" w:hAnsi="Arial"/>
+          <w:b/>
+          <w:sz w:val="22"/>
+          <w:rtl w:val="1"/>
+          <w:rFonts w:cs="Arial"/>
+        </w:rPr>
+        <w:t>מייל קר</w:t>
+      </w:r>
+      <w:r>
+        <w:rPr>
+          <w:rFonts w:ascii="Arial" w:hAnsi="Arial"/>
+          <w:b w:val="0"/>
+          <w:sz w:val="22"/>
+          <w:rtl w:val="1"/>
+          <w:rFonts w:cs="Arial"/>
+        </w:rPr>
+        <w:t xml:space="preserve"> (custom email keys), ו</w:t>
+      </w:r>
+      <w:r>
+        <w:rPr>
+          <w:rFonts w:ascii="Arial" w:hAnsi="Arial"/>
+          <w:b/>
+          <w:sz w:val="22"/>
+          <w:rtl w:val="1"/>
+          <w:rFonts w:cs="Arial"/>
+        </w:rPr>
+        <w:t>רשימת הבוט</w:t>
+      </w:r>
+      <w:r>
+        <w:rPr>
+          <w:rFonts w:ascii="Arial" w:hAnsi="Arial"/>
+          <w:b w:val="0"/>
+          <w:sz w:val="22"/>
+          <w:rtl w:val="1"/>
+          <w:rFonts w:cs="Arial"/>
+        </w:rPr>
+        <w:t xml:space="preserve"> (מסמן </w:t>
+      </w:r>
+      <w:r>
+        <w:rPr>
+          <w:rFonts w:ascii="Consolas" w:hAnsi="Consolas"/>
+          <w:b w:val="0"/>
+          <w:color w:val="B02A37"/>
+          <w:sz w:val="22"/>
+          <w:rtl w:val="1"/>
+          <w:rFonts w:cs="Consolas"/>
+        </w:rPr>
+        <w:t>*</w:t>
+      </w:r>
+      <w:r>
+        <w:rPr>
+          <w:rFonts w:ascii="Arial" w:hAnsi="Arial"/>
+          <w:b w:val="0"/>
+          <w:sz w:val="22"/>
+          <w:rtl w:val="1"/>
+          <w:rFonts w:cs="Arial"/>
+        </w:rPr>
+        <w:t xml:space="preserve"> למותאם). ולידציה מונעת שהעלאה שגויה תשבור את ה-runner. (canned replies §3.6.5 כבר תמכו בהעלאה עצמית.)</w:t>
+      </w:r>
+    </w:p>
+    <w:p>
+      <w:pPr>
         <w:bidi w:val="1"/>
         <w:ind w:left="360"/>
         <w:jc w:val="right"/>
@@ -13467,7 +13838,7 @@
           <w:rtl w:val="1"/>
           <w:rFonts w:cs="Arial"/>
         </w:rPr>
-        <w:t xml:space="preserve">), ולהריץ </w:t>
+        <w:t xml:space="preserve">, שרושם גם מותאמות), ולהריץ </w:t>
       </w:r>
       <w:r>
         <w:rPr>
@@ -13526,6 +13897,29 @@
           <w:rFonts w:cs="Consolas"/>
         </w:rPr>
         <w:t>canned_replies</w:t>
+      </w:r>
+      <w:r>
+        <w:rPr>
+          <w:rFonts w:ascii="Arial" w:hAnsi="Arial"/>
+          <w:b w:val="0"/>
+          <w:i/>
+          <w:sz w:val="22"/>
+          <w:rtl w:val="1"/>
+          <w:rFonts w:cs="Arial"/>
+        </w:rPr>
+        <w:t xml:space="preserve">, </w:t>
+      </w:r>
+      <w:r>
+        <w:rPr>
+          <w:rFonts w:ascii="Consolas" w:hAnsi="Consolas"/>
+          <w:b w:val="0"/>
+          <w:i/>
+          <w:color w:val="B02A37"/>
+          <w:sz w:val="22"/>
+          <w:rtl w:val="1"/>
+          <w:rFonts w:cs="Consolas"/>
+        </w:rPr>
+        <w:t>custom_templates</w:t>
       </w:r>
       <w:r>
         <w:rPr>

</xml_diff>

<commit_message>
docs(sdr): templates management UI (/templates)
Co-Authored-By: Claude Opus 4.8 (1M context) <noreply@anthropic.com>
</commit_message>
<xml_diff>
--- a/PRODUCTS/03-helix-sdr-bdr-bot.docx
+++ b/PRODUCTS/03-helix-sdr-bdr-bot.docx
@@ -13787,6 +13787,74 @@
           <w:rFonts w:cs="Arial"/>
         </w:rPr>
         <w:t xml:space="preserve"> למותאם). ולידציה מונעת שהעלאה שגויה תשבור את ה-runner. (canned replies §3.6.5 כבר תמכו בהעלאה עצמית.)</w:t>
+      </w:r>
+    </w:p>
+    <w:p>
+      <w:pPr>
+        <w:bidi w:val="1"/>
+        <w:jc w:val="right"/>
+      </w:pPr>
+      <w:r>
+        <w:rPr>
+          <w:rFonts w:ascii="Arial" w:hAnsi="Arial"/>
+          <w:b/>
+          <w:sz w:val="22"/>
+          <w:rtl w:val="1"/>
+          <w:rFonts w:cs="Arial"/>
+        </w:rPr>
+        <w:t>UI ניהול (`/templates`) 🆕:</w:t>
+      </w:r>
+      <w:r>
+        <w:rPr>
+          <w:rFonts w:ascii="Arial" w:hAnsi="Arial"/>
+          <w:b w:val="0"/>
+          <w:sz w:val="22"/>
+          <w:rtl w:val="1"/>
+          <w:rFonts w:cs="Arial"/>
+        </w:rPr>
+        <w:t xml:space="preserve"> עמוד ניהול RTL עם 3 טאבים (WhatsApp · מייל · תשובות שמורות) — מציג מובנות+מותאמות עם תגיות-מקור (מובנה/מותאם/דורס), עורך מודאלי להוספה/עריכה/מחיקה, ו"שכפל כמותאם" מתבנית מובנית. </w:t>
+      </w:r>
+      <w:r>
+        <w:rPr>
+          <w:rFonts w:ascii="Consolas" w:hAnsi="Consolas"/>
+          <w:b w:val="0"/>
+          <w:color w:val="B02A37"/>
+          <w:sz w:val="22"/>
+          <w:rtl w:val="1"/>
+          <w:rFonts w:cs="Consolas"/>
+        </w:rPr>
+        <w:t>GET /api/templates/list</w:t>
+      </w:r>
+      <w:r>
+        <w:rPr>
+          <w:rFonts w:ascii="Arial" w:hAnsi="Arial"/>
+          <w:b w:val="0"/>
+          <w:sz w:val="22"/>
+          <w:rtl w:val="1"/>
+          <w:rFonts w:cs="Arial"/>
+        </w:rPr>
+        <w:t xml:space="preserve"> (קטלוג ממוזג ל-UI) · </w:t>
+      </w:r>
+      <w:r>
+        <w:rPr>
+          <w:rFonts w:ascii="Consolas" w:hAnsi="Consolas"/>
+          <w:b w:val="0"/>
+          <w:color w:val="B02A37"/>
+          <w:sz w:val="22"/>
+          <w:rtl w:val="1"/>
+          <w:rFonts w:cs="Consolas"/>
+        </w:rPr>
+        <w:t>GET/POST/DELETE /api/canned</w:t>
+      </w:r>
+      <w:r>
+        <w:rPr>
+          <w:rFonts w:ascii="Arial" w:hAnsi="Arial"/>
+          <w:b w:val="0"/>
+          <w:sz w:val="22"/>
+          <w:rtl w:val="1"/>
+          <w:rFonts w:cs="Arial"/>
+        </w:rPr>
+        <w:t>.</w:t>
       </w:r>
     </w:p>
     <w:p>

</xml_diff>